<commit_message>
docs(manuscript): NAR figure-style consistency + Supplementary Data
- Unify all figure titles to one style (bold 13pt left-aligned suptitle, "Figure N.");
  Figure 3 was a different-sized multi-line axes title — now matches Figs 1-2,
  with a consistent gray subtitle for detail. Okabe-Ito palette throughout.
- Add Supplementary Data: DroPhenix_supplementary.md/.docx (Table S1 full 24-metric
  comparison, Table S2 per-module validation, Note S1 unequal-N example+simulation);
  add SUPPLEMENTARY DATA section + S1 citation to the main manuscript.
- Generalise build_docx.py to render any markdown -> submission-standard .docx.

Co-Authored-By: Claude Opus 4.8 <noreply@anthropic.com>
</commit_message>
<xml_diff>
--- a/manuscript/DroPhenix_manuscript.docx
+++ b/manuscript/DroPhenix_manuscript.docx
@@ -3326,7 +3326,7 @@
         <w:t>coxph(ties="efron")</w:t>
       </w:r>
       <w:r>
-        <w:t xml:space="preserve">) reflects the alternative tie approximation and is reported as a method note, not a discrepancy. scikit-survival could not be built in our environment (no C toolchain / no Python 3.13 wheel). Full machine-readable report: </w:t>
+        <w:t xml:space="preserve">) reflects the alternative tie approximation and is reported as a method note, not a discrepancy. scikit-survival could not be built in our environment (no C toolchain / no Python 3.13 wheel). The complete 24-metric comparison is given in Supplementary Table S1 (machine-readable: </w:t>
       </w:r>
       <w:r>
         <w:rPr>
@@ -3336,7 +3336,7 @@
         <w:t>validation/comparison_report.md</w:t>
       </w:r>
       <w:r>
-        <w:t>.</w:t>
+        <w:t>).</w:t>
       </w:r>
     </w:p>
     <w:p>
@@ -3502,7 +3502,7 @@
       <w:r>
         <w:drawing>
           <wp:inline xmlns:a="http://schemas.openxmlformats.org/drawingml/2006/main" xmlns:pic="http://schemas.openxmlformats.org/drawingml/2006/picture">
-            <wp:extent cx="5760720" cy="5442270"/>
+            <wp:extent cx="5760720" cy="4787722"/>
             <wp:docPr id="3" name="Picture 3"/>
             <wp:cNvGraphicFramePr>
               <a:graphicFrameLocks noChangeAspect="1"/>
@@ -3523,7 +3523,7 @@
                   <pic:spPr>
                     <a:xfrm>
                       <a:off x="0" y="0"/>
-                      <a:ext cx="5760720" cy="5442270"/>
+                      <a:ext cx="5760720" cy="4787722"/>
                     </a:xfrm>
                     <a:prstGeom prst="rect"/>
                   </pic:spPr>
@@ -3669,6 +3669,80 @@
       </w:r>
       <w:r>
         <w:t>) and the figure-generation scripts are distributed under the GNU General Public License v3. All benchmark datasets used here are published (Freireich 1963; PlantGrowth) or are reproducibly generated by the shipped scripts.</w:t>
+      </w:r>
+    </w:p>
+    <w:p>
+      <w:pPr>
+        <w:pStyle w:val="Heading1"/>
+      </w:pPr>
+      <w:r>
+        <w:t>SUPPLEMENTARY DATA</w:t>
+      </w:r>
+    </w:p>
+    <w:p>
+      <w:pPr>
+        <w:spacing w:line="480" w:lineRule="auto" w:after="120"/>
+        <w:jc w:val="both"/>
+      </w:pPr>
+      <w:r>
+        <w:t xml:space="preserve">Supplementary Data are available online. </w:t>
+      </w:r>
+      <w:r>
+        <w:rPr>
+          <w:b/>
+        </w:rPr>
+        <w:t>Supplementary Table S1</w:t>
+      </w:r>
+      <w:r>
+        <w:t xml:space="preserve"> gives the complete tool-by-tool comparison (all 24 quantitative metrics plus the two method notes). </w:t>
+      </w:r>
+      <w:r>
+        <w:rPr>
+          <w:b/>
+        </w:rPr>
+        <w:t>Supplementary Table S2</w:t>
+      </w:r>
+      <w:r>
+        <w:t xml:space="preserve"> lists the per-module validation tests against their published benchmarks. </w:t>
+      </w:r>
+      <w:r>
+        <w:rPr>
+          <w:b/>
+        </w:rPr>
+        <w:t>Supplementary Note S1</w:t>
+      </w:r>
+      <w:r>
+        <w:t xml:space="preserve"> provides the unequal-N worked example (per-strain weights) and the estimator-efficiency simulation underlying Figure 2. All are regenerated by the shipped scripts (</w:t>
+      </w:r>
+      <w:r>
+        <w:rPr>
+          <w:rFonts w:ascii="Consolas" w:hAnsi="Consolas"/>
+          <w:sz w:val="19"/>
+        </w:rPr>
+        <w:t>validation/run_all.py</w:t>
+      </w:r>
+      <w:r>
+        <w:t xml:space="preserve">, </w:t>
+      </w:r>
+      <w:r>
+        <w:rPr>
+          <w:rFonts w:ascii="Consolas" w:hAnsi="Consolas"/>
+          <w:sz w:val="19"/>
+        </w:rPr>
+        <w:t>comparison_study.py</w:t>
+      </w:r>
+      <w:r>
+        <w:t xml:space="preserve">, </w:t>
+      </w:r>
+      <w:r>
+        <w:rPr>
+          <w:rFonts w:ascii="Consolas" w:hAnsi="Consolas"/>
+          <w:sz w:val="19"/>
+        </w:rPr>
+        <w:t>demo_unequal_n.py</w:t>
+      </w:r>
+      <w:r>
+        <w:t>).</w:t>
       </w:r>
     </w:p>
     <w:p>

</xml_diff>

<commit_message>
docs(manuscript): editorial polish to NAR standard — contributions + conclusion
Add an explicit "here we present / three contributions" paragraph closing the
Introduction and a Conclusion section; rebuild the Word document (schema-valid).
No numbers, citations, tables or figures changed; citation integrity verified
(all 27 references cited, none orphaned).

Co-Authored-By: Claude Opus 4.8 <noreply@anthropic.com>
</commit_message>
<xml_diff>
--- a/manuscript/DroPhenix_manuscript.docx
+++ b/manuscript/DroPhenix_manuscript.docx
@@ -210,7 +210,25 @@
         <w:t>unequal sample size</w:t>
       </w:r>
       <w:r>
-        <w:t xml:space="preserve"> across multiple assays. In screening this is acute: when one genotype contributes three replicate vials and another seven, equal-weight averaging of group means is biased toward the smaller, noisier strain. DroPhenix closes these gaps in one free, browser-based, verifiable tool.</w:t>
+        <w:t xml:space="preserve"> across multiple assays. In screening this is acute: when one genotype contributes three replicate vials and another seven, equal-weight averaging of group means is biased toward the smaller, noisier strain.</w:t>
+      </w:r>
+    </w:p>
+    <w:p>
+      <w:pPr>
+        <w:spacing w:line="480" w:lineRule="auto" w:after="120"/>
+        <w:jc w:val="both"/>
+      </w:pPr>
+      <w:r>
+        <w:t xml:space="preserve">Here we present DroPhenix, a free, browser-based platform that unifies the analysis of six </w:t>
+      </w:r>
+      <w:r>
+        <w:rPr>
+          <w:i/>
+        </w:rPr>
+        <w:t>Drosophila</w:t>
+      </w:r>
+      <w:r>
+        <w:t xml:space="preserve"> assays behind one statistically transparent workflow, making three contributions. First, it applies assumption-aware, publication-grade statistics uniformly across every assay—normality- and variance-gated test selection, mandatory effect sizes, false-discovery-rate control and bootstrap intervals—rather than defaulting to a single test. Second, it enforces the scientifically correct measurement axis for each metric; most notably, it models motor decline as an exponential decay over animal age rather than over the within-assay seconds during which flies climb, a distinction that is frequently conflated. Third, and most novel, it introduces an actuarial meta-analytic engine that ranks compounds across strains of unequal size by inverse-variance / DerSimonian–Laird pooling and then across assays into a single Therapeutic Score. We benchmark every module against published data and against seven established analysis tools, and release the complete validation and comparison code so that correctness can be reproduced independently rather than assumed.</w:t>
       </w:r>
     </w:p>
     <w:p>
@@ -3619,6 +3637,32 @@
         <w:pStyle w:val="Heading1"/>
       </w:pPr>
       <w:r>
+        <w:t>CONCLUSION</w:t>
+      </w:r>
+    </w:p>
+    <w:p>
+      <w:pPr>
+        <w:spacing w:line="480" w:lineRule="auto" w:after="120"/>
+        <w:jc w:val="both"/>
+      </w:pPr>
+      <w:r>
+        <w:t xml:space="preserve">DroPhenix lowers the statistical barrier to rigorous, integrative </w:t>
+      </w:r>
+      <w:r>
+        <w:rPr>
+          <w:i/>
+        </w:rPr>
+        <w:t>Drosophila</w:t>
+      </w:r>
+      <w:r>
+        <w:t xml:space="preserve"> phenotyping and compound triage. By making each analysis correct by construction, benchmarked against published data and verifiable against gold-standard software, and by combining unequal-N cross-strain evidence through principled meta-analysis, it converts fragmented, spreadsheet-bound assay data into reproducible, publication-ready and translationally interpretable results within a single free web tool. Because the entire validation and comparison suite ships with the software, every quantitative claim in this paper can be regenerated with one command, which we hope sets a practical standard for verifiability in behavioural-analysis web servers.</w:t>
+      </w:r>
+    </w:p>
+    <w:p>
+      <w:pPr>
+        <w:pStyle w:val="Heading1"/>
+      </w:pPr>
+      <w:r>
         <w:t>DATA AVAILABILITY</w:t>
       </w:r>
     </w:p>

</xml_diff>